<commit_message>
Fix case sensitivity folder issue
</commit_message>
<xml_diff>
--- a/PROJECT5.docx
+++ b/PROJECT5.docx
@@ -5,6 +5,304 @@
     <w:p>
       <w:r>
         <w:t>PROJECT5</w:t>
+      </w:r>
+      <w:r>
+        <w:t xml:space="preserve">- </w:t>
+      </w:r>
+      <w:hyperlink r:id="rId4" w:history="1">
+        <w:r>
+          <w:rPr>
+            <w:rStyle w:val="Hyperlink"/>
+          </w:rPr>
+          <w:t>https://github.com/dugospace/StegHub-Projects/tree/mysql</w:t>
+        </w:r>
+      </w:hyperlink>
+    </w:p>
+    <w:p>
+      <w:r>
+        <w:t>Please, in case the screenshots are not showing. Kindly find them in the IMAGE folder.</w:t>
+      </w:r>
+    </w:p>
+    <w:p>
+      <w:r>
+        <w:t>Thank you</w:t>
+      </w:r>
+    </w:p>
+    <w:p/>
+    <w:p>
+      <w:r>
+        <w:drawing>
+          <wp:inline distT="0" distB="0" distL="0" distR="0" wp14:anchorId="607C13EA" wp14:editId="5FE77F34">
+            <wp:extent cx="5943600" cy="2435860"/>
+            <wp:effectExtent l="0" t="0" r="0" b="2540"/>
+            <wp:docPr id="1945958165" name="Picture 1" descr="A screenshot of a computer&#10;&#10;AI-generated content may be incorrect."/>
+            <wp:cNvGraphicFramePr>
+              <a:graphicFrameLocks xmlns:a="http://schemas.openxmlformats.org/drawingml/2006/main" noChangeAspect="1"/>
+            </wp:cNvGraphicFramePr>
+            <a:graphic xmlns:a="http://schemas.openxmlformats.org/drawingml/2006/main">
+              <a:graphicData uri="http://schemas.openxmlformats.org/drawingml/2006/picture">
+                <pic:pic xmlns:pic="http://schemas.openxmlformats.org/drawingml/2006/picture">
+                  <pic:nvPicPr>
+                    <pic:cNvPr id="1945958165" name="Picture 1" descr="A screenshot of a computer&#10;&#10;AI-generated content may be incorrect."/>
+                    <pic:cNvPicPr/>
+                  </pic:nvPicPr>
+                  <pic:blipFill>
+                    <a:blip r:embed="rId5"/>
+                    <a:stretch>
+                      <a:fillRect/>
+                    </a:stretch>
+                  </pic:blipFill>
+                  <pic:spPr>
+                    <a:xfrm>
+                      <a:off x="0" y="0"/>
+                      <a:ext cx="5943600" cy="2435860"/>
+                    </a:xfrm>
+                    <a:prstGeom prst="rect">
+                      <a:avLst/>
+                    </a:prstGeom>
+                  </pic:spPr>
+                </pic:pic>
+              </a:graphicData>
+            </a:graphic>
+          </wp:inline>
+        </w:drawing>
+      </w:r>
+    </w:p>
+    <w:p>
+      <w:r>
+        <w:drawing>
+          <wp:inline distT="0" distB="0" distL="0" distR="0" wp14:anchorId="636E641F" wp14:editId="073C69E6">
+            <wp:extent cx="5943600" cy="1837690"/>
+            <wp:effectExtent l="0" t="0" r="0" b="0"/>
+            <wp:docPr id="1038875473" name="Picture 1" descr="A screen shot of a computer screen&#10;&#10;AI-generated content may be incorrect."/>
+            <wp:cNvGraphicFramePr>
+              <a:graphicFrameLocks xmlns:a="http://schemas.openxmlformats.org/drawingml/2006/main" noChangeAspect="1"/>
+            </wp:cNvGraphicFramePr>
+            <a:graphic xmlns:a="http://schemas.openxmlformats.org/drawingml/2006/main">
+              <a:graphicData uri="http://schemas.openxmlformats.org/drawingml/2006/picture">
+                <pic:pic xmlns:pic="http://schemas.openxmlformats.org/drawingml/2006/picture">
+                  <pic:nvPicPr>
+                    <pic:cNvPr id="1038875473" name="Picture 1" descr="A screen shot of a computer screen&#10;&#10;AI-generated content may be incorrect."/>
+                    <pic:cNvPicPr/>
+                  </pic:nvPicPr>
+                  <pic:blipFill>
+                    <a:blip r:embed="rId6"/>
+                    <a:stretch>
+                      <a:fillRect/>
+                    </a:stretch>
+                  </pic:blipFill>
+                  <pic:spPr>
+                    <a:xfrm>
+                      <a:off x="0" y="0"/>
+                      <a:ext cx="5943600" cy="1837690"/>
+                    </a:xfrm>
+                    <a:prstGeom prst="rect">
+                      <a:avLst/>
+                    </a:prstGeom>
+                  </pic:spPr>
+                </pic:pic>
+              </a:graphicData>
+            </a:graphic>
+          </wp:inline>
+        </w:drawing>
+      </w:r>
+    </w:p>
+    <w:p>
+      <w:r>
+        <w:drawing>
+          <wp:inline distT="0" distB="0" distL="0" distR="0" wp14:anchorId="0AF98779" wp14:editId="67BC3257">
+            <wp:extent cx="5943600" cy="2347595"/>
+            <wp:effectExtent l="0" t="0" r="0" b="0"/>
+            <wp:docPr id="651667118" name="Picture 1" descr="A computer screen shot of a program&#10;&#10;AI-generated content may be incorrect."/>
+            <wp:cNvGraphicFramePr>
+              <a:graphicFrameLocks xmlns:a="http://schemas.openxmlformats.org/drawingml/2006/main" noChangeAspect="1"/>
+            </wp:cNvGraphicFramePr>
+            <a:graphic xmlns:a="http://schemas.openxmlformats.org/drawingml/2006/main">
+              <a:graphicData uri="http://schemas.openxmlformats.org/drawingml/2006/picture">
+                <pic:pic xmlns:pic="http://schemas.openxmlformats.org/drawingml/2006/picture">
+                  <pic:nvPicPr>
+                    <pic:cNvPr id="651667118" name="Picture 1" descr="A computer screen shot of a program&#10;&#10;AI-generated content may be incorrect."/>
+                    <pic:cNvPicPr/>
+                  </pic:nvPicPr>
+                  <pic:blipFill>
+                    <a:blip r:embed="rId7"/>
+                    <a:stretch>
+                      <a:fillRect/>
+                    </a:stretch>
+                  </pic:blipFill>
+                  <pic:spPr>
+                    <a:xfrm>
+                      <a:off x="0" y="0"/>
+                      <a:ext cx="5943600" cy="2347595"/>
+                    </a:xfrm>
+                    <a:prstGeom prst="rect">
+                      <a:avLst/>
+                    </a:prstGeom>
+                  </pic:spPr>
+                </pic:pic>
+              </a:graphicData>
+            </a:graphic>
+          </wp:inline>
+        </w:drawing>
+      </w:r>
+    </w:p>
+    <w:p>
+      <w:r>
+        <w:lastRenderedPageBreak/>
+        <w:drawing>
+          <wp:inline distT="0" distB="0" distL="0" distR="0" wp14:anchorId="610D8CE8" wp14:editId="1636756D">
+            <wp:extent cx="5943600" cy="1835785"/>
+            <wp:effectExtent l="0" t="0" r="0" b="0"/>
+            <wp:docPr id="1923798501" name="Picture 1" descr="A screenshot of a computer program&#10;&#10;AI-generated content may be incorrect."/>
+            <wp:cNvGraphicFramePr>
+              <a:graphicFrameLocks xmlns:a="http://schemas.openxmlformats.org/drawingml/2006/main" noChangeAspect="1"/>
+            </wp:cNvGraphicFramePr>
+            <a:graphic xmlns:a="http://schemas.openxmlformats.org/drawingml/2006/main">
+              <a:graphicData uri="http://schemas.openxmlformats.org/drawingml/2006/picture">
+                <pic:pic xmlns:pic="http://schemas.openxmlformats.org/drawingml/2006/picture">
+                  <pic:nvPicPr>
+                    <pic:cNvPr id="1923798501" name="Picture 1" descr="A screenshot of a computer program&#10;&#10;AI-generated content may be incorrect."/>
+                    <pic:cNvPicPr/>
+                  </pic:nvPicPr>
+                  <pic:blipFill>
+                    <a:blip r:embed="rId8"/>
+                    <a:stretch>
+                      <a:fillRect/>
+                    </a:stretch>
+                  </pic:blipFill>
+                  <pic:spPr>
+                    <a:xfrm>
+                      <a:off x="0" y="0"/>
+                      <a:ext cx="5943600" cy="1835785"/>
+                    </a:xfrm>
+                    <a:prstGeom prst="rect">
+                      <a:avLst/>
+                    </a:prstGeom>
+                  </pic:spPr>
+                </pic:pic>
+              </a:graphicData>
+            </a:graphic>
+          </wp:inline>
+        </w:drawing>
+      </w:r>
+    </w:p>
+    <w:p/>
+    <w:p>
+      <w:r>
+        <w:drawing>
+          <wp:inline distT="0" distB="0" distL="0" distR="0" wp14:anchorId="5A35A2EC" wp14:editId="7C86C13B">
+            <wp:extent cx="5943600" cy="2988945"/>
+            <wp:effectExtent l="0" t="0" r="0" b="1905"/>
+            <wp:docPr id="1091882155" name="Picture 1"/>
+            <wp:cNvGraphicFramePr>
+              <a:graphicFrameLocks xmlns:a="http://schemas.openxmlformats.org/drawingml/2006/main" noChangeAspect="1"/>
+            </wp:cNvGraphicFramePr>
+            <a:graphic xmlns:a="http://schemas.openxmlformats.org/drawingml/2006/main">
+              <a:graphicData uri="http://schemas.openxmlformats.org/drawingml/2006/picture">
+                <pic:pic xmlns:pic="http://schemas.openxmlformats.org/drawingml/2006/picture">
+                  <pic:nvPicPr>
+                    <pic:cNvPr id="1091882155" name=""/>
+                    <pic:cNvPicPr/>
+                  </pic:nvPicPr>
+                  <pic:blipFill>
+                    <a:blip r:embed="rId9"/>
+                    <a:stretch>
+                      <a:fillRect/>
+                    </a:stretch>
+                  </pic:blipFill>
+                  <pic:spPr>
+                    <a:xfrm>
+                      <a:off x="0" y="0"/>
+                      <a:ext cx="5943600" cy="2988945"/>
+                    </a:xfrm>
+                    <a:prstGeom prst="rect">
+                      <a:avLst/>
+                    </a:prstGeom>
+                  </pic:spPr>
+                </pic:pic>
+              </a:graphicData>
+            </a:graphic>
+          </wp:inline>
+        </w:drawing>
+      </w:r>
+    </w:p>
+    <w:p>
+      <w:r>
+        <w:drawing>
+          <wp:inline distT="0" distB="0" distL="0" distR="0" wp14:anchorId="36A20A7A" wp14:editId="4463B3D4">
+            <wp:extent cx="5943600" cy="2597785"/>
+            <wp:effectExtent l="0" t="0" r="0" b="0"/>
+            <wp:docPr id="898475966" name="Picture 1" descr="A screenshot of a computer program&#10;&#10;AI-generated content may be incorrect."/>
+            <wp:cNvGraphicFramePr>
+              <a:graphicFrameLocks xmlns:a="http://schemas.openxmlformats.org/drawingml/2006/main" noChangeAspect="1"/>
+            </wp:cNvGraphicFramePr>
+            <a:graphic xmlns:a="http://schemas.openxmlformats.org/drawingml/2006/main">
+              <a:graphicData uri="http://schemas.openxmlformats.org/drawingml/2006/picture">
+                <pic:pic xmlns:pic="http://schemas.openxmlformats.org/drawingml/2006/picture">
+                  <pic:nvPicPr>
+                    <pic:cNvPr id="898475966" name="Picture 1" descr="A screenshot of a computer program&#10;&#10;AI-generated content may be incorrect."/>
+                    <pic:cNvPicPr/>
+                  </pic:nvPicPr>
+                  <pic:blipFill>
+                    <a:blip r:embed="rId10"/>
+                    <a:stretch>
+                      <a:fillRect/>
+                    </a:stretch>
+                  </pic:blipFill>
+                  <pic:spPr>
+                    <a:xfrm>
+                      <a:off x="0" y="0"/>
+                      <a:ext cx="5943600" cy="2597785"/>
+                    </a:xfrm>
+                    <a:prstGeom prst="rect">
+                      <a:avLst/>
+                    </a:prstGeom>
+                  </pic:spPr>
+                </pic:pic>
+              </a:graphicData>
+            </a:graphic>
+          </wp:inline>
+        </w:drawing>
+      </w:r>
+    </w:p>
+    <w:p>
+      <w:r>
+        <w:lastRenderedPageBreak/>
+        <w:drawing>
+          <wp:inline distT="0" distB="0" distL="0" distR="0" wp14:anchorId="02FA7894" wp14:editId="4A683BBB">
+            <wp:extent cx="5943600" cy="2272665"/>
+            <wp:effectExtent l="0" t="0" r="0" b="0"/>
+            <wp:docPr id="289261030" name="Picture 1" descr="A screenshot of a computer&#10;&#10;AI-generated content may be incorrect."/>
+            <wp:cNvGraphicFramePr>
+              <a:graphicFrameLocks xmlns:a="http://schemas.openxmlformats.org/drawingml/2006/main" noChangeAspect="1"/>
+            </wp:cNvGraphicFramePr>
+            <a:graphic xmlns:a="http://schemas.openxmlformats.org/drawingml/2006/main">
+              <a:graphicData uri="http://schemas.openxmlformats.org/drawingml/2006/picture">
+                <pic:pic xmlns:pic="http://schemas.openxmlformats.org/drawingml/2006/picture">
+                  <pic:nvPicPr>
+                    <pic:cNvPr id="289261030" name="Picture 1" descr="A screenshot of a computer&#10;&#10;AI-generated content may be incorrect."/>
+                    <pic:cNvPicPr/>
+                  </pic:nvPicPr>
+                  <pic:blipFill>
+                    <a:blip r:embed="rId11"/>
+                    <a:stretch>
+                      <a:fillRect/>
+                    </a:stretch>
+                  </pic:blipFill>
+                  <pic:spPr>
+                    <a:xfrm>
+                      <a:off x="0" y="0"/>
+                      <a:ext cx="5943600" cy="2272665"/>
+                    </a:xfrm>
+                    <a:prstGeom prst="rect">
+                      <a:avLst/>
+                    </a:prstGeom>
+                  </pic:spPr>
+                </pic:pic>
+              </a:graphicData>
+            </a:graphic>
+          </wp:inline>
+        </w:drawing>
       </w:r>
     </w:p>
     <w:sectPr>
@@ -934,6 +1232,29 @@
       <w:spacing w:val="5"/>
     </w:rPr>
   </w:style>
+  <w:style w:type="character" w:styleId="Hyperlink">
+    <w:name w:val="Hyperlink"/>
+    <w:basedOn w:val="DefaultParagraphFont"/>
+    <w:uiPriority w:val="99"/>
+    <w:unhideWhenUsed/>
+    <w:rsid w:val="006A258D"/>
+    <w:rPr>
+      <w:color w:val="467886" w:themeColor="hyperlink"/>
+      <w:u w:val="single"/>
+    </w:rPr>
+  </w:style>
+  <w:style w:type="character" w:styleId="UnresolvedMention">
+    <w:name w:val="Unresolved Mention"/>
+    <w:basedOn w:val="DefaultParagraphFont"/>
+    <w:uiPriority w:val="99"/>
+    <w:semiHidden/>
+    <w:unhideWhenUsed/>
+    <w:rsid w:val="006A258D"/>
+    <w:rPr>
+      <w:color w:val="605E5C"/>
+      <w:shd w:val="clear" w:color="auto" w:fill="E1DFDD"/>
+    </w:rPr>
+  </w:style>
 </w:styles>
 </file>
 

</xml_diff>